<commit_message>
Fix unsupported policy searches in VS Code and add genuine development evidence
</commit_message>
<xml_diff>
--- a/hw3/hw3-Z23222679.docx
+++ b/hw3/hw3-Z23222679.docx
@@ -481,7 +481,7 @@
           <w:szCs w:val="28"/>
           <w:lang w:val="en-US" w:eastAsia="zh-CN" w:bidi="hi-IN"/>
         </w:rPr>
-        <w:t>Application Description: Incident Compass adds cited policy search, validated incident triage, and a restricted Terminal to a stateful LangChain agent. It uses fictional classroom policy and environment credentials. Twelve offline tests pass. Live Gemini requires verification. Keyword retrieval can miss synonyms; triage depends on supplied facts; memory resets on exit.</w:t>
+        <w:t>Application Description: Incident Compass adds cited policy search, validated incident triage, and a restricted Terminal to a stateful LangChain agent. It uses fictional classroom policy and environment credentials. Fifteen offline tests pass. Live Gemini requires verification. Keyword retrieval can miss synonyms; triage depends on supplied facts; memory resets on exit.</w:t>
       </w:r>
       <w:r>
         <w:rPr>
@@ -570,7 +570,7 @@
           <w:i/>
           <w:iCs/>
         </w:rPr>
-        <w:t xml:space="preserve">Task prompt: "new lab. https://icardei.github.io/gensec-web/labs/G03.2_hw_wk3/index.html?index=..%2F..gensec-web#0 do it ASAP." Required evidence: insert genuine VS Code screenshots of coding-agent prompts and responses, plus generated code, with Brehon Parker or Z23222679 visible.</w:t>
+        <w:t xml:space="preserve">Development evidence: The following pages document genuine follow-up development using the Codex agent in VS Code. Initial implementation was performed in Codex desktop, so this evidence does not claim that every original development task was performed in VS Code.</w:t>
       </w:r>
       <w:r>
         <w:rPr>
@@ -580,6 +580,142 @@
           <w:iCs/>
         </w:rPr>
         <w:t/>
+      </w:r>
+    </w:p>
+    <w:p>
+      <w:r>
+        <w:rPr>
+          <w:sz w:val="20"/>
+        </w:rPr>
+        <w:br w:type="page"/>
+      </w:r>
+    </w:p>
+    <w:p>
+      <w:r>
+        <w:rPr>
+          <w:b/>
+          <w:sz w:val="20"/>
+        </w:rPr>
+        <w:t>VS Code Development Evidence</w:t>
+      </w:r>
+    </w:p>
+    <w:p>
+      <w:r>
+        <w:rPr>
+          <w:sz w:val="20"/>
+        </w:rPr>
+        <w:t>Exact prompt: Brehon Parker / FAU ID Z23222679 / Homework 3. In hw3/tools.py, fix search_policy so a request for an unsupported explicit severity such as Severity 4 returns no policy evidence instead of unrelated Severity 1/2/3 sections. Add focused tests for unsupported severity and empty search queries in hw3/tests/test_agent.py; treat empty queries as no evidence. Preserve the existing tools, Terminal restrictions, and unrelated files. Use docstrings, run uv run pytest -q in hw3, and summarize the exact change and test result. Do not commit or push.</w:t>
+      </w:r>
+    </w:p>
+    <w:p>
+      <w:r>
+        <w:rPr>
+          <w:sz w:val="20"/>
+        </w:rPr>
+        <w:t>Agent response and task result: 15 tests passed; unsupported severities and blank queries return no evidence.</w:t>
+      </w:r>
+    </w:p>
+    <w:p>
+      <w:r>
+        <w:rPr>
+          <w:sz w:val="20"/>
+        </w:rPr>
+        <w:drawing>
+          <wp:inline xmlns:a="http://schemas.openxmlformats.org/drawingml/2006/main" xmlns:pic="http://schemas.openxmlformats.org/drawingml/2006/picture">
+            <wp:extent cx="6035040" cy="4023360"/>
+            <wp:docPr id="1" name="Picture 1"/>
+            <wp:cNvGraphicFramePr>
+              <a:graphicFrameLocks noChangeAspect="1"/>
+            </wp:cNvGraphicFramePr>
+            <a:graphic>
+              <a:graphicData uri="http://schemas.openxmlformats.org/drawingml/2006/picture">
+                <pic:pic>
+                  <pic:nvPicPr>
+                    <pic:cNvPr id="0" name="vscode-prompt-response.png"/>
+                    <pic:cNvPicPr/>
+                  </pic:nvPicPr>
+                  <pic:blipFill>
+                    <a:blip r:embed="rId9"/>
+                    <a:stretch>
+                      <a:fillRect/>
+                    </a:stretch>
+                  </pic:blipFill>
+                  <pic:spPr>
+                    <a:xfrm>
+                      <a:off x="0" y="0"/>
+                      <a:ext cx="6035040" cy="4023360"/>
+                    </a:xfrm>
+                    <a:prstGeom prst="rect"/>
+                  </pic:spPr>
+                </pic:pic>
+              </a:graphicData>
+            </a:graphic>
+          </wp:inline>
+        </w:drawing>
+      </w:r>
+    </w:p>
+    <w:p>
+      <w:r>
+        <w:rPr>
+          <w:sz w:val="20"/>
+        </w:rPr>
+        <w:br w:type="page"/>
+      </w:r>
+    </w:p>
+    <w:p>
+      <w:r>
+        <w:rPr>
+          <w:b/>
+          <w:sz w:val="20"/>
+        </w:rPr>
+        <w:t>Generated and Modified Code</w:t>
+      </w:r>
+    </w:p>
+    <w:p>
+      <w:r>
+        <w:rPr>
+          <w:sz w:val="20"/>
+        </w:rPr>
+        <w:t>Brehon Parker / FAU ID Z23222679. Actual VS Code source view showing the modified search_policy function. Name/ID header added for attribution after the agent task.</w:t>
+      </w:r>
+    </w:p>
+    <w:p>
+      <w:r>
+        <w:rPr>
+          <w:sz w:val="20"/>
+        </w:rPr>
+        <w:drawing>
+          <wp:inline xmlns:a="http://schemas.openxmlformats.org/drawingml/2006/main" xmlns:pic="http://schemas.openxmlformats.org/drawingml/2006/picture">
+            <wp:extent cx="6035040" cy="4023360"/>
+            <wp:docPr id="2" name="Picture 2"/>
+            <wp:cNvGraphicFramePr>
+              <a:graphicFrameLocks noChangeAspect="1"/>
+            </wp:cNvGraphicFramePr>
+            <a:graphic>
+              <a:graphicData uri="http://schemas.openxmlformats.org/drawingml/2006/picture">
+                <pic:pic>
+                  <pic:nvPicPr>
+                    <pic:cNvPr id="0" name="vscode-code.png"/>
+                    <pic:cNvPicPr/>
+                  </pic:nvPicPr>
+                  <pic:blipFill>
+                    <a:blip r:embed="rId10"/>
+                    <a:stretch>
+                      <a:fillRect/>
+                    </a:stretch>
+                  </pic:blipFill>
+                  <pic:spPr>
+                    <a:xfrm>
+                      <a:off x="0" y="0"/>
+                      <a:ext cx="6035040" cy="4023360"/>
+                    </a:xfrm>
+                    <a:prstGeom prst="rect"/>
+                  </pic:spPr>
+                </pic:pic>
+              </a:graphicData>
+            </a:graphic>
+          </wp:inline>
+        </w:drawing>
       </w:r>
     </w:p>
     <w:sectPr>

</xml_diff>

<commit_message>
Recapture development screenshots with pointer outside evidence crop
</commit_message>
<xml_diff>
--- a/hw3/hw3-Z23222679.docx
+++ b/hw3/hw3-Z23222679.docx
@@ -622,7 +622,7 @@
         </w:rPr>
         <w:drawing>
           <wp:inline xmlns:a="http://schemas.openxmlformats.org/drawingml/2006/main" xmlns:pic="http://schemas.openxmlformats.org/drawingml/2006/picture">
-            <wp:extent cx="6035040" cy="4023360"/>
+            <wp:extent cx="6035040" cy="3847338"/>
             <wp:docPr id="1" name="Picture 1"/>
             <wp:cNvGraphicFramePr>
               <a:graphicFrameLocks noChangeAspect="1"/>
@@ -643,7 +643,7 @@
                   <pic:spPr>
                     <a:xfrm>
                       <a:off x="0" y="0"/>
-                      <a:ext cx="6035040" cy="4023360"/>
+                      <a:ext cx="6035040" cy="3847338"/>
                     </a:xfrm>
                     <a:prstGeom prst="rect"/>
                   </pic:spPr>
@@ -686,7 +686,7 @@
         </w:rPr>
         <w:drawing>
           <wp:inline xmlns:a="http://schemas.openxmlformats.org/drawingml/2006/main" xmlns:pic="http://schemas.openxmlformats.org/drawingml/2006/picture">
-            <wp:extent cx="6035040" cy="4023360"/>
+            <wp:extent cx="6035040" cy="3847338"/>
             <wp:docPr id="2" name="Picture 2"/>
             <wp:cNvGraphicFramePr>
               <a:graphicFrameLocks noChangeAspect="1"/>
@@ -707,7 +707,7 @@
                   <pic:spPr>
                     <a:xfrm>
                       <a:off x="0" y="0"/>
-                      <a:ext cx="6035040" cy="4023360"/>
+                      <a:ext cx="6035040" cy="3847338"/>
                     </a:xfrm>
                     <a:prstGeom prst="rect"/>
                   </pic:spPr>

</xml_diff>